<commit_message>
feat: add PO/price-drift review, LlamaParse and Postgres vector flags
</commit_message>
<xml_diff>
--- a/fixtures/contracts/vendor_alpha_contract.docx
+++ b/fixtures/contracts/vendor_alpha_contract.docx
@@ -148,6 +148,11 @@
         </w:tc>
       </w:tr>
     </w:tbl>
+    <w:p>
+      <w:r>
+        <w:t>Approved purchase orders: PO-4452. Invoices must reference an approved PO.</w:t>
+      </w:r>
+    </w:p>
     <w:p>
       <w:r>
         <w:t>Unit prices on invoices must match this schedule. A variance greater than 5% is grounds for rejection pending renegotiation.</w:t>

</xml_diff>